<commit_message>
Simplify variant 13 report explanations and layout
</commit_message>
<xml_diff>
--- a/reports/variant13.docx
+++ b/reports/variant13.docx
@@ -78,7 +78,7 @@
           <w:rFonts w:ascii="Times New Roman" w:hAnsi="Times New Roman"/>
           <w:b w:val="0"/>
         </w:rPr>
-        <w:t>Освоить переход от алгоритма проверки входной записи к конечному автомату: разработать распознаватель для индивидуального задания, разметить блок-схему под автомат Мура и проверить полученную модель в JFLAP.</w:t>
+        <w:t>Разработать алгоритм проверки цепочек для варианта 13, построить по нему автомат Мура и проверить его работу в программе JFLAP.</w:t>
       </w:r>
     </w:p>
     <w:p>
@@ -89,7 +89,7 @@
         <w:rPr>
           <w:rFonts w:ascii="Times New Roman" w:hAnsi="Times New Roman"/>
         </w:rPr>
-        <w:t>1 Индивидуальное задание</w:t>
+        <w:t>1 Задание для варианта 13</w:t>
       </w:r>
     </w:p>
     <w:p>
@@ -101,7 +101,7 @@
           <w:rFonts w:ascii="Times New Roman" w:hAnsi="Times New Roman"/>
           <w:b w:val="0"/>
         </w:rPr>
-        <w:t>Вариант 13. В приложении 2 методического пособия этому варианту соответствует контрольная подцепочка dca. Исходный алфавит Σ = {a, b, c, d}. Проверяется средний символ c: непосредственно перед ним должен находиться d, а непосредственно после него — a. Это условие относится к каждому вхождению c, а не только к первому найденному фрагменту dca.</w:t>
+        <w:t>Вариант 13 — контрольная подцепочка dca. Цепочки состоят из букв a, b, c и d. По заданию нужно проверять букву c: перед ней обязательно должна стоять буква d, а после неё — буква a. Это правило должно выполняться для каждой буквы c в цепочке.</w:t>
       </w:r>
     </w:p>
     <w:p>
@@ -113,7 +113,7 @@
           <w:rFonts w:ascii="Times New Roman" w:hAnsi="Times New Roman"/>
           <w:b w:val="0"/>
         </w:rPr>
-        <w:t>Буквы a, b и d могут встречаться в любом количестве. Если c отсутствует, распознаватель сообщает об этом отдельным сигналом. Если хотя бы у одного c нарушен требуемый контекст, вся цепочка относится к ошибочным.</w:t>
+        <w:t>Буквы a, b и d можно использовать без дополнительных ограничений. Если c не встречается, это отмечается отдельным результатом. Если хотя бы одна буква c стоит неправильно, вся цепочка считается ошибочной.</w:t>
       </w:r>
     </w:p>
     <w:p>
@@ -125,7 +125,7 @@
           <w:rFonts w:ascii="Times New Roman" w:hAnsi="Times New Roman"/>
           <w:b w:val="0"/>
         </w:rPr>
-        <w:t>Для слова w = x₁x₂…xₙ условие правильности можно записать следующим образом: для любого i, такого что xᵢ = c, выполняются 1 &lt; i &lt; n, xᵢ₋₁ = d и xᵢ₊₁ = a. Таким образом, c в начале или в конце слова всегда означает нарушение.</w:t>
+        <w:t>Например, dca и dcadca соответствуют заданию. Цепочки dcb и aca не подходят: в первом случае после c стоит b, а во втором перед c стоит a. Буква c в начале или в конце цепочки также означает ошибку.</w:t>
       </w:r>
     </w:p>
     <w:p>
@@ -137,7 +137,7 @@
           <w:rFonts w:ascii="Times New Roman" w:hAnsi="Times New Roman"/>
           <w:b w:val="0"/>
         </w:rPr>
-        <w:t>Во входную запись добавляется служебный символ z, обозначающий её конец. Он не входит в Σ. Автомат получает запись wz, где w ∈ Σ*, а z встречается ровно один раз, в последней позиции. Например, слово dca проверяется вводом dcaz; пустое слово — вводом z.</w:t>
+        <w:t>Для обозначения конца цепочки используется служебный символ z. Он добавляется только в конце и не относится к исходному алфавиту. Поэтому для проверки dca в JFLAP вводится dcaz, а для проверки пустой цепочки — z.</w:t>
       </w:r>
     </w:p>
     <w:p>
@@ -367,7 +367,7 @@
         <w:rPr>
           <w:rFonts w:ascii="Times New Roman" w:hAnsi="Times New Roman"/>
         </w:rPr>
-        <w:t>2 Разработка распознавателя</w:t>
+        <w:t>2 Ход работы</w:t>
       </w:r>
     </w:p>
     <w:p>
@@ -378,7 +378,7 @@
         <w:rPr>
           <w:rFonts w:ascii="Times New Roman" w:hAnsi="Times New Roman"/>
         </w:rPr>
-        <w:t>2.1 Логика проверки и память автомата</w:t>
+        <w:t>2.1 Алгоритм и состояния автомата</w:t>
       </w:r>
     </w:p>
     <w:p>
@@ -390,7 +390,7 @@
           <w:rFonts w:ascii="Times New Roman" w:hAnsi="Times New Roman"/>
           <w:b w:val="0"/>
         </w:rPr>
-        <w:t>Просмотр выполняется слева направо. До первого c достаточно помнить, был ли предыдущий символ равен d. После пары dc необходим отдельный шаг ожидания a. Когда этот символ получен, факт правильного вхождения c сохраняется, а проверка продолжается для оставшейся части слова.</w:t>
+        <w:t>Алгоритм читает цепочку слева направо. Проверка выполняется в следующем порядке:</w:t>
       </w:r>
     </w:p>
     <w:p>
@@ -402,7 +402,55 @@
           <w:rFonts w:ascii="Times New Roman" w:hAnsi="Times New Roman"/>
           <w:b w:val="0"/>
         </w:rPr>
-        <w:t>Модель имеет вид M = (Q, Z, W, δ, λ, q0), где Q = {q0, …, q8}, Z = {a, b, c, d, z}, W = {y1, y2, y3}. Начальное состояние — q0. Функция δ задаёт переходы, λ — выход текущего состояния. Рабочие состояния имеют пустой выход ε; это отсутствие сигнала, а не четвёртый элемент W.</w:t>
+        <w:t>1. Начать в состоянии q0. Пока c не встретилась, запоминать, была ли предыдущая буква равна d.</w:t>
+      </w:r>
+    </w:p>
+    <w:p>
+      <w:pPr>
+        <w:jc w:val="both"/>
+      </w:pPr>
+      <w:r>
+        <w:rPr>
+          <w:rFonts w:ascii="Times New Roman" w:hAnsi="Times New Roman"/>
+          <w:b w:val="0"/>
+        </w:rPr>
+        <w:t>2. При чтении c проверить её левого соседа. Если это d, перейти к ожиданию буквы a. Если перед c стояла другая буква или c находится в начале цепочки, запомнить ошибку.</w:t>
+      </w:r>
+    </w:p>
+    <w:p>
+      <w:pPr>
+        <w:jc w:val="both"/>
+      </w:pPr>
+      <w:r>
+        <w:rPr>
+          <w:rFonts w:ascii="Times New Roman" w:hAnsi="Times New Roman"/>
+          <w:b w:val="0"/>
+        </w:rPr>
+        <w:t>3. Проверить следующий символ после c. Буква a завершает правильный фрагмент dca. После этого продолжить просмотр. Любая другая буква или конец цепочки означает ошибку.</w:t>
+      </w:r>
+    </w:p>
+    <w:p>
+      <w:pPr>
+        <w:jc w:val="both"/>
+      </w:pPr>
+      <w:r>
+        <w:rPr>
+          <w:rFonts w:ascii="Times New Roman" w:hAnsi="Times New Roman"/>
+          <w:b w:val="0"/>
+        </w:rPr>
+        <w:t>4. При чтении z выдать результат: y1 — буквы c не было; y2 — все буквы c стоят правильно; y3 — обнаружена ошибка. После этого завершить работу.</w:t>
+      </w:r>
+    </w:p>
+    <w:p>
+      <w:pPr>
+        <w:jc w:val="both"/>
+      </w:pPr>
+      <w:r>
+        <w:rPr>
+          <w:rFonts w:ascii="Times New Roman" w:hAnsi="Times New Roman"/>
+          <w:b w:val="0"/>
+        </w:rPr>
+        <w:t>Выбран автомат Мура: его выход определяется текущим состоянием. Входной алфавит — {a, b, c, d, z}, выходные сигналы — {y1, y2, y3}. Состояния q0–q8 описаны в таблице 2. Обозначение ε означает пустой выход: сигнал в этом состоянии не выдаётся.</w:t>
       </w:r>
     </w:p>
     <w:p>
@@ -471,7 +519,7 @@
                 <w:b/>
                 <w:sz w:val="22"/>
               </w:rPr>
-              <w:t>Сохраняемая информация / действие</w:t>
+              <w:t>Что означает состояние</w:t>
             </w:r>
           </w:p>
         </w:tc>
@@ -1084,18 +1132,6 @@
     </w:tbl>
     <w:p>
       <w:pPr>
-        <w:jc w:val="both"/>
-      </w:pPr>
-      <w:r>
-        <w:rPr>
-          <w:rFonts w:ascii="Times New Roman" w:hAnsi="Times New Roman"/>
-          <w:b w:val="0"/>
-        </w:rPr>
-        <w:t>Из q1 и q4 чтение c переводит модель в q2. Только a завершает проверку пары dc и приводит в q3. Буквы b, c или d из q2 ведут в q5; конец записи z — непосредственно в q8. Из q5 восстановление корректности невозможно: последующий правильный фрагмент не отменяет уже найденную ошибку.</w:t>
-      </w:r>
-    </w:p>
-    <w:p>
-      <w:pPr>
         <w:spacing w:line="240" w:lineRule="auto" w:before="0" w:after="0"/>
         <w:ind w:firstLine="0"/>
       </w:pPr>
@@ -1127,7 +1163,7 @@
           <w:rFonts w:ascii="Times New Roman" w:hAnsi="Times New Roman"/>
           <w:b w:val="0"/>
         </w:rPr>
-        <w:t>Блок-схема представлена двумя связанными фрагментами. Прямоугольники qᵢ / ε обозначают операторные вершины без выходного сигнала, параллелограммы — чтение символа. Ромб выполняет ветвление по значению x; подписи перечисляют взаимоисключающие значения входа.</w:t>
+        <w:t>Блок-схема разделена на два рисунка для удобства чтения. Прямоугольники обозначают состояния, параллелограммы — чтение очередного символа x, ромбы — проверку его значения. Над стрелками указаны буквы, при которых выполняется переход.</w:t>
       </w:r>
     </w:p>
     <w:p>
@@ -1139,7 +1175,7 @@
           <w:rFonts w:ascii="Times New Roman" w:hAnsi="Times New Roman"/>
           <w:b w:val="0"/>
         </w:rPr>
-        <w:t>Круг qⱼ — соединитель с операторным блоком одноимённого состояния. Он не является новым состоянием. После перехода через такой соединитель выполняется соответствующий модуль и читается следующая буква. Начало работы — вход в q0.</w:t>
+        <w:t>Кружок с номером q обозначает переход к блоку с таким же номером. Например, кружок q2 направляет к блоку q2 на этом рисунке. Он не добавляет новое состояние. Работа начинается с блока q0.</w:t>
       </w:r>
     </w:p>
     <w:p>
@@ -1209,7 +1245,7 @@
           <w:rFonts w:ascii="Times New Roman" w:hAnsi="Times New Roman"/>
           <w:b w:val="0"/>
         </w:rPr>
-        <w:t>В q0 буквы a и b не меняют признак предыдущего d. В q1 последовательные d сохраняют этот признак; a или b его сбрасывают. В q2 очередной символ проверяется как правый сосед уже прочитанного c. При поступлении z вместо a формируется Y₃.</w:t>
+        <w:t>Состояния q0 и q1 нужны для проверки буквы перед c. В q1 предыдущая буква равна d, поэтому c переводит автомат в q2. В q2 проверяется буква после c: только a позволяет продолжить работу без ошибки.</w:t>
       </w:r>
     </w:p>
     <w:p>
@@ -1303,7 +1339,7 @@
           <w:rFonts w:ascii="Times New Roman" w:hAnsi="Times New Roman"/>
           <w:b w:val="0"/>
         </w:rPr>
-        <w:t>Состояния q3 и q4 используются после первого завершённого dca. Переход q4 → q2 позволяет проверять повторные вхождения c. В состоянии q3 чтение c означает неверного левого соседа, поэтому выполняется переход к q5.</w:t>
+        <w:t>После первого правильного фрагмента dca используются состояния q3 и q4. Они, как и q0 и q1, различают, была ли последняя прочитанная буква равна d. Это нужно для проверки следующих букв c.</w:t>
       </w:r>
     </w:p>
     <w:p>
@@ -1315,7 +1351,7 @@
           <w:rFonts w:ascii="Times New Roman" w:hAnsi="Times New Roman"/>
           <w:b w:val="0"/>
         </w:rPr>
-        <w:t>Операторные вершины q6 / Y₁, q7 / Y₂ и q8 / Y₃ завершают обработку записи. Выход в них зависит только от состояния, что соответствует автомату Мура. Во всех фрагментах схемы, таблице и модели JFLAP используется одна и та же нумерация.</w:t>
+        <w:t>Разметка соответствует автомату Мура: выходы Y₁, Y₂ и Y₃ закреплены за блоками q6, q7 и q8. В остальных состояниях выход пустой. Номера состояний на блок-схеме, в таблице и на графе совпадают.</w:t>
       </w:r>
     </w:p>
     <w:p>
@@ -1327,7 +1363,7 @@
           <w:rFonts w:ascii="Times New Roman" w:hAnsi="Times New Roman"/>
           <w:b w:val="0"/>
         </w:rPr>
-        <w:t>После фиксации ошибки q5 циклически читает буквы исходного алфавита. При z управление переходит в q8. Дочитывание необходимо для единого протокола выдачи результата: итоговый сигнал появляется только после конца записи.</w:t>
+        <w:t>При ошибке автомат переходит в q5 и дочитывает цепочку. После z он переходит в q8 и выдаёт y3. В q6 и q7 формируются результаты y1 и y2 соответственно.</w:t>
       </w:r>
     </w:p>
     <w:p>
@@ -1363,7 +1399,7 @@
           <w:rFonts w:ascii="Times New Roman" w:hAnsi="Times New Roman"/>
           <w:b w:val="0"/>
         </w:rPr>
-        <w:t>Таблица построена по размеченным модулям алгоритма. Заголовок столбца содержит состояние и закреплённый за ним выход. В ячейке указан результат перехода по очередному входному символу.</w:t>
+        <w:t>По блок-схеме составлена таблица переходов. В первом столбце указан входной символ, а в остальных — состояние, в которое перейдёт автомат. В заголовке рядом с номером состояния записан его выход.</w:t>
       </w:r>
     </w:p>
     <w:p>
@@ -1376,7 +1412,7 @@
           <w:rFonts w:ascii="Times New Roman" w:hAnsi="Times New Roman"/>
           <w:sz w:val="24"/>
         </w:rPr>
-        <w:t>Таблица 3 — Функции переходов δ и выходов λ</w:t>
+        <w:t>Таблица 3 — Переходы и выходы автомата</w:t>
       </w:r>
     </w:p>
     <w:tbl>
@@ -2639,7 +2675,7 @@
           <w:rFonts w:ascii="Times New Roman" w:hAnsi="Times New Roman"/>
           <w:b w:val="0"/>
         </w:rPr>
-        <w:t>Прочерк означает отсутствие перехода. Состояния q6, q7 и q8 завершают работу: после единственного z в корректно оформленной записи символов больше нет. Для рабочих состояний определены переходы по всем пяти символам; недетерминированных альтернатив нет.</w:t>
+        <w:t>Прочерк означает, что перехода нет. Из q6, q7 и q8 автомат дальше не переходит, поскольку цепочка уже закончилась. Из каждого рабочего состояния предусмотрен переход по любой букве входного алфавита.</w:t>
       </w:r>
     </w:p>
     <w:p>
@@ -2662,7 +2698,7 @@
           <w:rFonts w:ascii="Times New Roman" w:hAnsi="Times New Roman"/>
           <w:b w:val="0"/>
         </w:rPr>
-        <w:t>1. Вход dcaz: q0 → q1 → q2 → q3 → q7. После d запоминается левый сосед; c включает ожидание a; a подтверждает контекст; z вызывает единственный сигнал y2.</w:t>
+        <w:t>1. Для dcaz: q0 → q1 → q2 → q3 → q7. Перед c стоит d, после неё — a. Цепочка правильная, результат y2.</w:t>
       </w:r>
     </w:p>
     <w:p>
@@ -2674,7 +2710,7 @@
           <w:rFonts w:ascii="Times New Roman" w:hAnsi="Times New Roman"/>
           <w:b w:val="0"/>
         </w:rPr>
-        <w:t>2. Вход dcz: q0 → q1 → q2 → q8. Правый сосед c отсутствует, поэтому даже при правильном левом соседе получается y3.</w:t>
+        <w:t>2. Для dcz: q0 → q1 → q2 → q8. После c нет буквы a, поэтому получается y3.</w:t>
       </w:r>
     </w:p>
     <w:p>
@@ -2686,7 +2722,7 @@
           <w:rFonts w:ascii="Times New Roman" w:hAnsi="Times New Roman"/>
           <w:b w:val="0"/>
         </w:rPr>
-        <w:t>3. Вход dcadcaz: q0 → q1 → q2 → q3 → q4 → q2 → q3 → q7. Оба вхождения c проходят одинаковую проверку; результат — y2.</w:t>
+        <w:t>3. Для dcadcaz: q0 → q1 → q2 → q3 → q4 → q2 → q3 → q7. Обе буквы c стоят между d и a, результат y2.</w:t>
       </w:r>
     </w:p>
     <w:p>
@@ -2698,7 +2734,7 @@
           <w:rFonts w:ascii="Times New Roman" w:hAnsi="Times New Roman"/>
           <w:b w:val="0"/>
         </w:rPr>
-        <w:t>4. Вход dcacz: q0 → q1 → q2 → q3 → q5 → q8. Первый контекст правильный, но второй c следует за a. Сохранённая ошибка определяет результат y3.</w:t>
+        <w:t>4. Для dcacz: q0 → q1 → q2 → q3 → q5 → q8. Первый фрагмент dca правильный, но перед второй c стоит a. Результат — y3.</w:t>
       </w:r>
     </w:p>
     <w:p>
@@ -2710,7 +2746,7 @@
           <w:rFonts w:ascii="Times New Roman" w:hAnsi="Times New Roman"/>
           <w:b w:val="0"/>
         </w:rPr>
-        <w:t>Число состояний равно 9, число переходов по отдельным входным символам — 30. Внешние переменные модели не требуются: вся информация о просмотренной части слова закодирована в текущем состоянии.</w:t>
+        <w:t>Полученный автомат содержит 9 состояний и 30 переходов по отдельным входным символам.</w:t>
       </w:r>
     </w:p>
     <w:p>
@@ -2746,7 +2782,7 @@
           <w:rFonts w:ascii="Times New Roman" w:hAnsi="Times New Roman"/>
           <w:b w:val="0"/>
         </w:rPr>
-        <w:t>Для моделирования выбран тип Moore Machine. Созданы состояния q0–q8 и 30 переходов по таблице 3. Состояние q0 отмечено начальным. В полях Output состояний q6, q7 и q8 записаны соответственно y1, y2 и y3; в остальных состояниях поля оставлены пустыми.</w:t>
+        <w:t>В JFLAP выбрана модель Moore Machine. По таблице созданы состояния q0–q8 и переходы между ними. Начальным отмечено q0. Для q6, q7 и q8 заданы выходы y1, y2 и y3. Поля выхода остальных состояний оставлены пустыми.</w:t>
       </w:r>
     </w:p>
     <w:p>
@@ -2816,7 +2852,7 @@
           <w:rFonts w:ascii="Times New Roman" w:hAnsi="Times New Roman"/>
           <w:b w:val="0"/>
         </w:rPr>
-        <w:t>На снимке λ обозначает пустую строку в принятой программой записи. Она соответствует ε в таблице и не добавляет символов к результату. Стрелки графа помечены буквами входа; выходы показаны возле состояний.</w:t>
+        <w:t>На графе возле состояния показан его выход, а на стрелках — входные буквы. Символ λ в JFLAP обозначает пустой выход и соответствует ε в таблице.</w:t>
       </w:r>
     </w:p>
     <w:p>
@@ -2828,7 +2864,7 @@
           <w:rFonts w:ascii="Times New Roman" w:hAnsi="Times New Roman"/>
           <w:b w:val="0"/>
         </w:rPr>
-        <w:t>Модель сохранена в файле variant13.jff. Моделирование выполнено в интерфейсе JFLAP на основе версии 7.0 (сборка jflap-lib 1.3). При открытии файла используются тип moore и заданные в нём выходы состояний; для совместимости выход принимающего состояния также указан в поле transout соответствующих переходов.</w:t>
+        <w:t>Модель сохранена в файле variant13.jff. Для проверки использован интерфейс JFLAP на основе версии 7.0 (сборка jflap-lib 1.3).</w:t>
       </w:r>
     </w:p>
     <w:p>
@@ -2840,7 +2876,7 @@
           <w:rFonts w:ascii="Times New Roman" w:hAnsi="Times New Roman"/>
           <w:b w:val="0"/>
         </w:rPr>
-        <w:t>В режиме Multiple Run вводятся полные записи с z. В столбце Result ожидается строка y1, y2 или y3, а не ответ Accept/Reject: автомат выполняет преобразование входной записи в итоговый сигнал.</w:t>
+        <w:t>Проверка выполнена в режиме Multiple Run. В каждую строку введена цепочка с z в конце. В столбце Result программа показывает итоговый сигнал y1, y2 или y3.</w:t>
       </w:r>
     </w:p>
     <w:p>
@@ -2876,7 +2912,7 @@
           <w:rFonts w:ascii="Times New Roman" w:hAnsi="Times New Roman"/>
           <w:b w:val="0"/>
         </w:rPr>
-        <w:t>Набор тестов охватывает отсутствие c, один и несколько корректных контекстов, ошибку у левого или правого соседа, а также нарушения после уже распознанного dca. Пустое слово представлено единственным служебным символом z.</w:t>
+        <w:t>Для проверки выбраны цепочки с разными ситуациями: без c, с правильным фрагментом dca, с несколькими такими фрагментами и с ошибками возле c. Отдельно проверены пустая цепочка и c на границах слова.</w:t>
       </w:r>
     </w:p>
     <w:p>
@@ -4912,7 +4948,7 @@
           <w:rFonts w:ascii="Times New Roman" w:hAnsi="Times New Roman"/>
           <w:b w:val="0"/>
         </w:rPr>
-        <w:t>Все 18 результатов совпали с ожидаемыми. Каждая выходная строка содержит ровно один сигнал. Снимок выполненного запуска приведён на рисунке 4.</w:t>
+        <w:t>Все 18 результатов JFLAP совпали с ожидаемыми. Для каждой цепочки получен один итоговый сигнал. Окно с результатами показано на рисунке 4.</w:t>
       </w:r>
     </w:p>
     <w:p>
@@ -4936,7 +4972,7 @@
         <w:rPr>
           <w:rFonts w:ascii="Times New Roman" w:hAnsi="Times New Roman"/>
         </w:rPr>
-        <w:t>2.6 Анализ результатов</w:t>
+        <w:t>2.6 Разбор результатов</w:t>
       </w:r>
     </w:p>
     <w:p>
@@ -4951,7 +4987,7 @@
         </w:rPr>
         <w:drawing>
           <wp:inline xmlns:a="http://schemas.openxmlformats.org/drawingml/2006/main" xmlns:pic="http://schemas.openxmlformats.org/drawingml/2006/picture">
-            <wp:extent cx="5220000" cy="3242727"/>
+            <wp:extent cx="5940000" cy="2520000"/>
             <wp:docPr id="5" name="Picture 5"/>
             <wp:cNvGraphicFramePr>
               <a:graphicFrameLocks noChangeAspect="1"/>
@@ -4960,7 +4996,7 @@
               <a:graphicData uri="http://schemas.openxmlformats.org/drawingml/2006/picture">
                 <pic:pic>
                   <pic:nvPicPr>
-                    <pic:cNvPr id="0" name="jflap_tests.png"/>
+                    <pic:cNvPr id="0" name="jflap_tests_small.png"/>
                     <pic:cNvPicPr/>
                   </pic:nvPicPr>
                   <pic:blipFill>
@@ -4972,7 +5008,7 @@
                   <pic:spPr>
                     <a:xfrm>
                       <a:off x="0" y="0"/>
-                      <a:ext cx="5220000" cy="3242727"/>
+                      <a:ext cx="5940000" cy="2520000"/>
                     </a:xfrm>
                     <a:prstGeom prst="rect"/>
                   </pic:spPr>
@@ -5006,7 +5042,7 @@
           <w:rFonts w:ascii="Times New Roman" w:hAnsi="Times New Roman"/>
           <w:b w:val="0"/>
         </w:rPr>
-        <w:t>Входы z, abddaz и dz дают y1: наличие d само по себе не требует появления c. Входы dcaz, dcadcaz и ddcaaz дают y2, поскольку у каждого c проверены оба непосредственных соседа. Повторение букв вне проверяемого контекста разрешено.</w:t>
+        <w:t>Результаты подтверждают все три случая из задания. Для z и abddaz получен y1, потому что буквы c нет. Для dcaz и dcadcaz получен y2: каждая c находится между d и a. Для caz, dcz и dcbz получен y3 из-за неправильного положения c.</w:t>
       </w:r>
     </w:p>
     <w:p>
@@ -5018,32 +5054,7 @@
           <w:rFonts w:ascii="Times New Roman" w:hAnsi="Times New Roman"/>
           <w:b w:val="0"/>
         </w:rPr>
-        <w:t>Входы caz и dcz демонстрируют нарушения на границах слова. Слово dccaa содержит два соседних c, поэтому не удовлетворяет правилу. В тесте dcacz ошибка возникает после завершённого dca; автомат правильно не сохраняет прежний положительный результат.</w:t>
-      </w:r>
-    </w:p>
-    <w:p>
-      <w:pPr>
-        <w:jc w:val="both"/>
-      </w:pPr>
-      <w:r>
-        <w:rPr>
-          <w:rFonts w:ascii="Times New Roman" w:hAnsi="Times New Roman"/>
-          <w:b w:val="0"/>
-        </w:rPr>
-        <w:t>Дополнительно таблица переходов проверена программно для всех слов над Σ длиной от 0 до 8 включительно — 87 381 цепочки. Полученный сигнал сравнивался с независимым условием: для каждой позиции c проверялись наличие соседей и их равенство d и a. Расхождений не обнаружено. Эта проверка дополняет 18 запусков JFLAP; полный перебор не выполнялся в интерфейсе программы.</w:t>
-      </w:r>
-    </w:p>
-    <w:p>
-      <w:pPr>
-        <w:spacing w:line="240" w:lineRule="auto" w:before="0" w:after="0"/>
-        <w:ind w:firstLine="0"/>
-      </w:pPr>
-      <w:r>
-        <w:rPr>
-          <w:rFonts w:ascii="Times New Roman" w:hAnsi="Times New Roman"/>
-          <w:sz w:val="2"/>
-        </w:rPr>
-        <w:br w:type="page"/>
+        <w:t>Тест dcacz показывает, что одного правильного фрагмента недостаточно. Первая c стоит правильно, а вторая — нет, поэтому результат y3. Значит, автомат проверяет все буквы c в цепочке.</w:t>
       </w:r>
     </w:p>
     <w:p>
@@ -5066,7 +5077,7 @@
           <w:rFonts w:ascii="Times New Roman" w:hAnsi="Times New Roman"/>
           <w:b w:val="0"/>
         </w:rPr>
-        <w:t>Разработан распознаватель для варианта 13, проверяющий использование c только в контексте dca. Алгоритм разделяет запоминание левого соседа, ожидание правого соседа и сохранение ошибки. Это позволяет проверять каждое вхождение c, включая случаи, когда нарушение появляется после нескольких правильных фрагментов.</w:t>
+        <w:t>В ходе работы разработан алгоритм для варианта 13, подготовлены блок-схема с разметкой, таблица переходов и граф автомата Мура. Автомат проверяет, чтобы каждая буква c находилась между d и a.</w:t>
       </w:r>
     </w:p>
     <w:p>
@@ -5078,19 +5089,7 @@
           <w:rFonts w:ascii="Times New Roman" w:hAnsi="Times New Roman"/>
           <w:b w:val="0"/>
         </w:rPr>
-        <w:t>Подготовлены размеченная блок-схема, таблица переходов-выходов и модель автомата Мура из девяти состояний. Формирование сигнала отложено до символа z, поэтому одной входной записи соответствует один из трёх результатов: отсутствие проверяемой буквы, корректное использование всех её вхождений или нарушение условия.</w:t>
-      </w:r>
-    </w:p>
-    <w:p>
-      <w:pPr>
-        <w:jc w:val="both"/>
-      </w:pPr>
-      <w:r>
-        <w:rPr>
-          <w:rFonts w:ascii="Times New Roman" w:hAnsi="Times New Roman"/>
-          <w:b w:val="0"/>
-        </w:rPr>
-        <w:t>Работа модели проверена в JFLAP на 18 тестовых записях. Все ожидаемые выходы подтверждены; снимки рабочего окна фиксируют граф и результаты запуска. Дополнительный перебор 87 381 цепочки не выявил расхождений между таблицей переходов и условием индивидуального задания.</w:t>
+        <w:t>Проверка в JFLAP показала правильные результаты для всех 18 выбранных цепочек. Автомат различает отсутствие c, правильное использование c и ошибку. Результат выдаётся после служебного символа z.</w:t>
       </w:r>
     </w:p>
     <w:p>

</xml_diff>